<commit_message>
Koton: the riff and drum grids drawn as Koton Studio's
The piano roll: a 26 px rounded pad per slice (26 px rows), tinted by
pitch class (C lighter, black keys darker), the beat's first slice
lighter, every row named, teal notes; the chord tones keep a light tint;
it opens on the first note. The drum grid: 26 x 28 pads in each lane's
family colour (Koton Studio's DrumColors), dark when empty, bright when
hit, a pad a click; a groove is shown and customised on the coarsest
resolution that keeps every hit (4 a beat for sixteenths).
Screenshots, docs/04 and the manual (en, fr) follow.

Co-Authored-By: Claude Opus 5.5 <noreply@anthropic.com>
Claude-Session: https://claude.ai/code/session_01GQR2HPR9tf5GJjUSCW3Lgo
</commit_message>
<xml_diff>
--- a/docs/exports/04-USER-GUIDE.docx
+++ b/docs/exports/04-USER-GUIDE.docx
@@ -50631,7 +50631,13 @@
         <w:t xml:space="preserve">Riff</w:t>
       </w:r>
       <w:r>
-        <w:t xml:space="preserve">: the piano roll — the chords over it, their tones shaded in the rows (the root stronger),</w:t>
+        <w:t xml:space="preserve">: the piano roll, drawn as Koton Studio's (a square pad per slice, 26 px, every row named,</w:t>
+      </w:r>
+      <w:r>
+        <w:t xml:space="preserve"> </w:t>
+      </w:r>
+      <w:r>
+        <w:t xml:space="preserve">teal notes; it opens on the first note) — the chords over it, their tones shaded in the rows (the root stronger),</w:t>
       </w:r>
       <w:r>
         <w:t xml:space="preserve"> </w:t>
@@ -50903,7 +50909,13 @@
         <w:t xml:space="preserve"> </w:t>
       </w:r>
       <w:r>
-        <w:t xml:space="preserve">General MIDI percussion lanes you draw (a click puts / removes a hit),</w:t>
+        <w:t xml:space="preserve">General MIDI percussion lanes you draw (a click puts / removes a hit; Koton Studio's square pads in</w:t>
+      </w:r>
+      <w:r>
+        <w:t xml:space="preserve"> </w:t>
+      </w:r>
+      <w:r>
+        <w:t xml:space="preserve">each lane's family colour, 4 steps a beat when the groove allows),</w:t>
       </w:r>
       <w:r>
         <w:t xml:space="preserve"> </w:t>

</xml_diff>